<commit_message>
feat: complete the 10_Tir workshop's task and finalize the steps
</commit_message>
<xml_diff>
--- a/00_workshop/01_10_Tir/Workshop_task.docx
+++ b/00_workshop/01_10_Tir/Workshop_task.docx
@@ -2836,16 +2836,7 @@
           <w:szCs w:val="28"/>
           <w:rtl/>
         </w:rPr>
-        <w:t xml:space="preserve">پاکسازی داده ها: </w:t>
-      </w:r>
-      <w:r>
-        <w:rPr>
-          <w:rFonts w:cs="2  Nazanin"/>
-          <w:sz w:val="28"/>
-          <w:szCs w:val="28"/>
-          <w:rtl/>
-        </w:rPr>
-        <w:t>نویز در تصاویر</w:t>
+        <w:t>پاکسازی داده ها: نویز در تصاویر</w:t>
       </w:r>
       <w:r>
         <w:rPr>
@@ -7344,6 +7335,9 @@
             </m:den>
           </m:f>
           <m:r>
+            <m:rPr>
+              <m:sty m:val="p"/>
+            </m:rPr>
             <w:rPr>
               <w:rFonts w:eastAsia="Times New Roman" w:cs="2  Nazanin"/>
               <w:kern w:val="0"/>
@@ -7423,19 +7417,7 @@
           <w:lang w:bidi="fa-IR"/>
           <w14:ligatures w14:val="none"/>
         </w:rPr>
-        <w:t xml:space="preserve"> </w:t>
-      </w:r>
-      <w:r>
-        <w:rPr>
-          <w:rFonts w:eastAsia="Times New Roman" w:cs="2  Nazanin"/>
-          <w:kern w:val="0"/>
-          <w:sz w:val="28"/>
-          <w:szCs w:val="28"/>
-          <w:rtl/>
-          <w:lang w:bidi="fa-IR"/>
-          <w14:ligatures w14:val="none"/>
-        </w:rPr>
-        <w:t>برای جراح، مرز تومور خیلی مهم است تا موقع جراحی بافت سالم را نبُرد. این معیار بررسی می‌کند که لبه‌های نقاشیِ مدل ما، حداکثر چقدر با لبه‌های واقعی تومور فاصله و خطا دارد.</w:t>
+        <w:t xml:space="preserve"> برای جراح، مرز تومور خیلی مهم است تا موقع جراحی بافت سالم را نبُرد. این معیار بررسی می‌کند که لبه‌های نقاشیِ مدل ما، حداکثر چقدر با لبه‌های واقعی تومور فاصله و خطا دارد.</w:t>
       </w:r>
     </w:p>
     <w:p>
@@ -10053,13 +10035,916 @@
         <w:bidi/>
         <w:jc w:val="both"/>
         <w:rPr>
+          <w:rFonts w:cs="2  Nazanin"/>
+          <w:sz w:val="28"/>
+          <w:szCs w:val="28"/>
+          <w:lang w:bidi="fa-IR"/>
+        </w:rPr>
+      </w:pPr>
+    </w:p>
+    <w:p>
+      <w:pPr>
+        <w:bidi/>
+        <w:jc w:val="both"/>
+        <w:rPr>
+          <w:rFonts w:cs="2  Nazanin"/>
+          <w:sz w:val="28"/>
+          <w:szCs w:val="28"/>
+        </w:rPr>
+      </w:pPr>
+      <w:r>
+        <w:rPr>
+          <w:rFonts w:cs="2  Nazanin"/>
+          <w:b/>
+          <w:bCs/>
+          <w:sz w:val="28"/>
+          <w:szCs w:val="28"/>
+          <w:rtl/>
+        </w:rPr>
+        <w:t>چه زمانی نیاز به بازآموزی است؟</w:t>
+      </w:r>
+      <w:r>
+        <w:rPr>
+          <w:rFonts w:cs="2  Nazanin"/>
+          <w:sz w:val="28"/>
+          <w:szCs w:val="28"/>
+          <w:rtl/>
+        </w:rPr>
+        <w:t xml:space="preserve"> اگر در گام </w:t>
+      </w:r>
+      <w:r>
+        <w:rPr>
+          <w:rFonts w:cs="2  Nazanin"/>
+          <w:sz w:val="28"/>
+          <w:szCs w:val="28"/>
+          <w:rtl/>
+          <w:lang w:bidi="fa-IR"/>
+        </w:rPr>
+        <w:t>۱۲</w:t>
+      </w:r>
+      <w:r>
+        <w:rPr>
+          <w:rFonts w:cs="2  Nazanin"/>
+          <w:sz w:val="28"/>
+          <w:szCs w:val="28"/>
+          <w:rtl/>
+        </w:rPr>
+        <w:t xml:space="preserve"> افت عملکرد</w:t>
+      </w:r>
+      <w:r>
+        <w:rPr>
+          <w:rFonts w:cs="2  Nazanin"/>
+          <w:sz w:val="28"/>
+          <w:szCs w:val="28"/>
+          <w:lang w:bidi="fa-IR"/>
+        </w:rPr>
+        <w:t xml:space="preserve"> (Data Drift) </w:t>
+      </w:r>
+      <w:r>
+        <w:rPr>
+          <w:rFonts w:cs="2  Nazanin"/>
+          <w:sz w:val="28"/>
+          <w:szCs w:val="28"/>
+          <w:rtl/>
+        </w:rPr>
+        <w:t>مشاهده شد، دستگاه‌های</w:t>
+      </w:r>
+      <w:r>
+        <w:rPr>
+          <w:rFonts w:cs="2  Nazanin"/>
+          <w:sz w:val="28"/>
+          <w:szCs w:val="28"/>
+          <w:lang w:bidi="fa-IR"/>
+        </w:rPr>
+        <w:t xml:space="preserve"> CT </w:t>
+      </w:r>
+      <w:r>
+        <w:rPr>
+          <w:rFonts w:cs="2  Nazanin"/>
+          <w:sz w:val="28"/>
+          <w:szCs w:val="28"/>
+          <w:rtl/>
+        </w:rPr>
+        <w:t>بیمارستان عوض شدند، یا رادیولوژیست‌ها خطاهای سیستماتیک در خروجی مدل دیدند، زمان بازآموزی فرا رسیده است</w:t>
+      </w:r>
+      <w:r>
+        <w:rPr>
+          <w:rFonts w:cs="2  Nazanin"/>
+          <w:sz w:val="28"/>
+          <w:szCs w:val="28"/>
+          <w:lang w:bidi="fa-IR"/>
+        </w:rPr>
+        <w:t xml:space="preserve">. </w:t>
+      </w:r>
+    </w:p>
+    <w:p>
+      <w:pPr>
+        <w:bidi/>
+        <w:jc w:val="both"/>
+        <w:rPr>
+          <w:rFonts w:cs="2  Nazanin"/>
+          <w:sz w:val="28"/>
+          <w:szCs w:val="28"/>
+          <w:lang w:bidi="fa-IR"/>
+        </w:rPr>
+      </w:pPr>
+      <w:r>
+        <w:rPr>
+          <w:rFonts w:cs="2  Nazanin"/>
+          <w:b/>
+          <w:bCs/>
+          <w:sz w:val="28"/>
+          <w:szCs w:val="28"/>
+          <w:lang w:bidi="fa-IR"/>
+        </w:rPr>
+        <w:t xml:space="preserve"> </w:t>
+      </w:r>
+      <w:r>
+        <w:rPr>
+          <w:rFonts w:cs="2  Nazanin"/>
+          <w:b/>
+          <w:bCs/>
+          <w:sz w:val="28"/>
+          <w:szCs w:val="28"/>
+          <w:rtl/>
+        </w:rPr>
+        <w:t>به‌روزرسانی داده‌ها</w:t>
+      </w:r>
+      <w:r>
+        <w:rPr>
+          <w:rFonts w:cs="2  Nazanin"/>
+          <w:b/>
+          <w:bCs/>
+          <w:sz w:val="28"/>
+          <w:szCs w:val="28"/>
+          <w:lang w:bidi="fa-IR"/>
+        </w:rPr>
+        <w:t>:</w:t>
+      </w:r>
+      <w:r>
+        <w:rPr>
+          <w:rFonts w:cs="2  Nazanin"/>
+          <w:sz w:val="28"/>
+          <w:szCs w:val="28"/>
+          <w:lang w:bidi="fa-IR"/>
+        </w:rPr>
+        <w:t xml:space="preserve"> </w:t>
+      </w:r>
+      <w:r>
+        <w:rPr>
+          <w:rFonts w:cs="2  Nazanin"/>
+          <w:sz w:val="28"/>
+          <w:szCs w:val="28"/>
+          <w:rtl/>
+        </w:rPr>
+        <w:t>خطاهایی که مدل در محیط واقعی داشته (مثل تشخیص اشتباه یک کیست به جای تومور) توسط پزشک اصلاح شده و به دیتاسِت آموزشی اضافه می‌شود تا مدل از اشتباهات خودش یاد بگیرد</w:t>
+      </w:r>
+      <w:r>
+        <w:rPr>
+          <w:rFonts w:cs="2  Nazanin"/>
+          <w:sz w:val="28"/>
+          <w:szCs w:val="28"/>
+          <w:lang w:bidi="fa-IR"/>
+        </w:rPr>
+        <w:t xml:space="preserve"> (</w:t>
+      </w:r>
+      <w:r>
+        <w:rPr>
+          <w:rFonts w:cs="2  Nazanin"/>
+          <w:sz w:val="28"/>
+          <w:szCs w:val="28"/>
+          <w:rtl/>
+        </w:rPr>
+        <w:t>مفهوم</w:t>
+      </w:r>
+      <w:r>
+        <w:rPr>
+          <w:rFonts w:cs="2  Nazanin"/>
+          <w:sz w:val="28"/>
+          <w:szCs w:val="28"/>
+          <w:lang w:bidi="fa-IR"/>
+        </w:rPr>
+        <w:t xml:space="preserve"> Active Learning). </w:t>
+      </w:r>
+    </w:p>
+    <w:p>
+      <w:pPr>
+        <w:bidi/>
+        <w:jc w:val="both"/>
+        <w:rPr>
+          <w:rFonts w:cs="2  Nazanin"/>
+          <w:sz w:val="28"/>
+          <w:szCs w:val="28"/>
+          <w:lang w:bidi="fa-IR"/>
+        </w:rPr>
+      </w:pPr>
+      <w:r>
+        <w:rPr>
+          <w:rFonts w:cs="2  Nazanin"/>
+          <w:b/>
+          <w:bCs/>
+          <w:sz w:val="28"/>
+          <w:szCs w:val="28"/>
+          <w:lang w:bidi="fa-IR"/>
+        </w:rPr>
+        <w:t xml:space="preserve"> </w:t>
+      </w:r>
+      <w:r>
+        <w:rPr>
+          <w:rFonts w:cs="2  Nazanin"/>
+          <w:b/>
+          <w:bCs/>
+          <w:sz w:val="28"/>
+          <w:szCs w:val="28"/>
+          <w:rtl/>
+        </w:rPr>
+        <w:t>مدیریت نسخه‌ها</w:t>
+      </w:r>
+      <w:r>
+        <w:rPr>
+          <w:rFonts w:cs="2  Nazanin"/>
+          <w:b/>
+          <w:bCs/>
+          <w:sz w:val="28"/>
+          <w:szCs w:val="28"/>
+          <w:lang w:bidi="fa-IR"/>
+        </w:rPr>
+        <w:t xml:space="preserve"> (Model Versioning):</w:t>
+      </w:r>
+      <w:r>
+        <w:rPr>
+          <w:rFonts w:cs="2  Nazanin"/>
+          <w:sz w:val="28"/>
+          <w:szCs w:val="28"/>
+          <w:lang w:bidi="fa-IR"/>
+        </w:rPr>
+        <w:t xml:space="preserve"> </w:t>
+      </w:r>
+      <w:r>
+        <w:rPr>
+          <w:rFonts w:cs="2  Nazanin"/>
+          <w:sz w:val="28"/>
+          <w:szCs w:val="28"/>
+          <w:rtl/>
+        </w:rPr>
+        <w:t>وقتی مدل جدید آموزش دید، مستقیم جایگزین نمی‌شود؛ بلکه نسخه‌بندی می‌شود</w:t>
+      </w:r>
+      <w:r>
+        <w:rPr>
+          <w:rFonts w:cs="2  Nazanin"/>
+          <w:sz w:val="28"/>
+          <w:szCs w:val="28"/>
+          <w:lang w:bidi="fa-IR"/>
+        </w:rPr>
+        <w:t xml:space="preserve"> (</w:t>
+      </w:r>
+      <w:r>
+        <w:rPr>
+          <w:rFonts w:cs="2  Nazanin"/>
+          <w:sz w:val="28"/>
+          <w:szCs w:val="28"/>
+          <w:rtl/>
+        </w:rPr>
+        <w:t>مثلاً مدل</w:t>
+      </w:r>
+      <w:r>
+        <w:rPr>
+          <w:rFonts w:cs="2  Nazanin"/>
+          <w:sz w:val="28"/>
+          <w:szCs w:val="28"/>
+          <w:lang w:bidi="fa-IR"/>
+        </w:rPr>
+        <w:t xml:space="preserve"> V2). </w:t>
+      </w:r>
+      <w:r>
+        <w:rPr>
+          <w:rFonts w:cs="2  Nazanin"/>
+          <w:sz w:val="28"/>
+          <w:szCs w:val="28"/>
+          <w:rtl/>
+        </w:rPr>
+        <w:t>این کار اجازه می‌دهد اگر مدل جدید در عمل فاجعه‌بار بود، سیستم فوراً به نسخه پایدار قبلی</w:t>
+      </w:r>
+      <w:r>
+        <w:rPr>
+          <w:rFonts w:cs="2  Nazanin"/>
+          <w:sz w:val="28"/>
+          <w:szCs w:val="28"/>
+          <w:lang w:bidi="fa-IR"/>
+        </w:rPr>
+        <w:t xml:space="preserve"> (V1) </w:t>
+      </w:r>
+      <w:r>
+        <w:rPr>
+          <w:rFonts w:cs="2  Nazanin"/>
+          <w:sz w:val="28"/>
+          <w:szCs w:val="28"/>
+          <w:rtl/>
+        </w:rPr>
+        <w:t>برگردد</w:t>
+      </w:r>
+      <w:r>
+        <w:rPr>
+          <w:rFonts w:cs="2  Nazanin"/>
+          <w:sz w:val="28"/>
+          <w:szCs w:val="28"/>
+          <w:lang w:bidi="fa-IR"/>
+        </w:rPr>
+        <w:t xml:space="preserve"> (Rollback).</w:t>
+      </w:r>
+    </w:p>
+    <w:p>
+      <w:pPr>
+        <w:bidi/>
+        <w:jc w:val="both"/>
+        <w:rPr>
+          <w:rFonts w:cs="2  Nazanin"/>
+          <w:sz w:val="28"/>
+          <w:szCs w:val="28"/>
+          <w:lang w:bidi="fa-IR"/>
+        </w:rPr>
+      </w:pPr>
+    </w:p>
+    <w:p>
+      <w:pPr>
+        <w:bidi/>
+        <w:jc w:val="both"/>
+        <w:rPr>
+          <w:rFonts w:cs="2  Nazanin"/>
+          <w:sz w:val="28"/>
+          <w:szCs w:val="28"/>
+          <w:rtl/>
+          <w:lang w:bidi="fa-IR"/>
+        </w:rPr>
+      </w:pPr>
+    </w:p>
+    <w:p>
+      <w:pPr>
+        <w:bidi/>
+        <w:jc w:val="both"/>
+        <w:rPr>
+          <w:rFonts w:cs="2  Nazanin"/>
+          <w:sz w:val="28"/>
+          <w:szCs w:val="28"/>
+          <w:rtl/>
+          <w:lang w:bidi="fa-IR"/>
+        </w:rPr>
+      </w:pPr>
+    </w:p>
+    <w:p>
+      <w:pPr>
+        <w:bidi/>
+        <w:jc w:val="both"/>
+        <w:rPr>
+          <w:rFonts w:cs="2  Nazanin"/>
+          <w:sz w:val="28"/>
+          <w:szCs w:val="28"/>
+          <w:rtl/>
+          <w:lang w:bidi="fa-IR"/>
+        </w:rPr>
+      </w:pPr>
+    </w:p>
+    <w:p>
+      <w:pPr>
+        <w:bidi/>
+        <w:jc w:val="both"/>
+        <w:rPr>
+          <w:rFonts w:cs="2  Nazanin"/>
+          <w:sz w:val="28"/>
+          <w:szCs w:val="28"/>
+          <w:rtl/>
+          <w:lang w:bidi="fa-IR"/>
+        </w:rPr>
+      </w:pPr>
+    </w:p>
+    <w:p>
+      <w:pPr>
+        <w:bidi/>
+        <w:jc w:val="both"/>
+        <w:rPr>
+          <w:rFonts w:cs="2  Nazanin"/>
+          <w:sz w:val="28"/>
+          <w:szCs w:val="28"/>
+          <w:rtl/>
+          <w:lang w:bidi="fa-IR"/>
+        </w:rPr>
+      </w:pPr>
+    </w:p>
+    <w:p>
+      <w:pPr>
+        <w:bidi/>
+        <w:jc w:val="both"/>
+        <w:rPr>
+          <w:rFonts w:cs="2  Nazanin"/>
+          <w:sz w:val="28"/>
+          <w:szCs w:val="28"/>
+          <w:rtl/>
+          <w:lang w:bidi="fa-IR"/>
+        </w:rPr>
+      </w:pPr>
+    </w:p>
+    <w:p>
+      <w:pPr>
+        <w:bidi/>
+        <w:jc w:val="both"/>
+        <w:rPr>
+          <w:rFonts w:cs="2  Nazanin"/>
+          <w:sz w:val="28"/>
+          <w:szCs w:val="28"/>
+          <w:rtl/>
+          <w:lang w:bidi="fa-IR"/>
+        </w:rPr>
+      </w:pPr>
+    </w:p>
+    <w:p>
+      <w:pPr>
+        <w:bidi/>
+        <w:jc w:val="both"/>
+        <w:rPr>
+          <w:rFonts w:cs="2  Nazanin"/>
+          <w:sz w:val="28"/>
+          <w:szCs w:val="28"/>
+          <w:rtl/>
+          <w:lang w:bidi="fa-IR"/>
+        </w:rPr>
+      </w:pPr>
+      <w:r>
+        <w:rPr>
           <w:rFonts w:cs="2  Nazanin" w:hint="cs"/>
           <w:sz w:val="28"/>
           <w:szCs w:val="28"/>
           <w:rtl/>
           <w:lang w:bidi="fa-IR"/>
         </w:rPr>
-      </w:pPr>
+        <w:lastRenderedPageBreak/>
+        <w:t>گام ۱۴: ملاحضات اخلاقی و قانونی</w:t>
+      </w:r>
+    </w:p>
+    <w:p>
+      <w:pPr>
+        <w:pStyle w:val="ListParagraph"/>
+        <w:numPr>
+          <w:ilvl w:val="0"/>
+          <w:numId w:val="34"/>
+        </w:numPr>
+        <w:bidi/>
+        <w:jc w:val="both"/>
+        <w:rPr>
+          <w:rFonts w:cs="2  Nazanin"/>
+          <w:sz w:val="28"/>
+          <w:szCs w:val="28"/>
+          <w:rtl/>
+          <w:lang w:bidi="fa-IR"/>
+        </w:rPr>
+      </w:pPr>
+      <w:r>
+        <w:rPr>
+          <w:rFonts w:cs="2  Nazanin" w:hint="cs"/>
+          <w:sz w:val="28"/>
+          <w:szCs w:val="28"/>
+          <w:rtl/>
+          <w:lang w:bidi="fa-IR"/>
+        </w:rPr>
+        <w:t>حریم خصوصی کاربران و امنیت داده ها</w:t>
+      </w:r>
+    </w:p>
+    <w:p>
+      <w:pPr>
+        <w:pStyle w:val="ListParagraph"/>
+        <w:numPr>
+          <w:ilvl w:val="0"/>
+          <w:numId w:val="34"/>
+        </w:numPr>
+        <w:bidi/>
+        <w:jc w:val="both"/>
+        <w:rPr>
+          <w:rFonts w:cs="2  Nazanin"/>
+          <w:sz w:val="28"/>
+          <w:szCs w:val="28"/>
+          <w:rtl/>
+          <w:lang w:bidi="fa-IR"/>
+        </w:rPr>
+      </w:pPr>
+      <w:r>
+        <w:rPr>
+          <w:rFonts w:cs="2  Nazanin" w:hint="cs"/>
+          <w:sz w:val="28"/>
+          <w:szCs w:val="28"/>
+          <w:rtl/>
+          <w:lang w:bidi="fa-IR"/>
+        </w:rPr>
+        <w:t>شفافیت در تصمیم گیری و کاهش سوگیری ها</w:t>
+      </w:r>
+    </w:p>
+    <w:p>
+      <w:pPr>
+        <w:pStyle w:val="ListParagraph"/>
+        <w:numPr>
+          <w:ilvl w:val="0"/>
+          <w:numId w:val="34"/>
+        </w:numPr>
+        <w:bidi/>
+        <w:jc w:val="both"/>
+        <w:rPr>
+          <w:rFonts w:cs="2  Nazanin"/>
+          <w:sz w:val="28"/>
+          <w:szCs w:val="28"/>
+          <w:rtl/>
+          <w:lang w:bidi="fa-IR"/>
+        </w:rPr>
+      </w:pPr>
+      <w:r>
+        <w:rPr>
+          <w:rFonts w:cs="2  Nazanin" w:hint="cs"/>
+          <w:sz w:val="28"/>
+          <w:szCs w:val="28"/>
+          <w:rtl/>
+          <w:lang w:bidi="fa-IR"/>
+        </w:rPr>
+        <w:t>مسئولیت پذیری در خطاها و پیامدهای اجتماعی</w:t>
+      </w:r>
+    </w:p>
+    <w:p>
+      <w:pPr>
+        <w:bidi/>
+        <w:jc w:val="both"/>
+        <w:rPr>
+          <w:rFonts w:cs="2  Nazanin"/>
+          <w:sz w:val="28"/>
+          <w:szCs w:val="28"/>
+          <w:rtl/>
+          <w:lang w:bidi="fa-IR"/>
+        </w:rPr>
+      </w:pPr>
+      <w:r>
+        <w:rPr>
+          <w:rFonts w:cs="2  Nazanin"/>
+          <w:b/>
+          <w:bCs/>
+          <w:sz w:val="28"/>
+          <w:szCs w:val="28"/>
+          <w:rtl/>
+        </w:rPr>
+        <w:t>حریم خصوصی و امنیت داده‌ها</w:t>
+      </w:r>
+      <w:r>
+        <w:rPr>
+          <w:rFonts w:cs="2  Nazanin"/>
+          <w:b/>
+          <w:bCs/>
+          <w:sz w:val="28"/>
+          <w:szCs w:val="28"/>
+          <w:lang w:bidi="fa-IR"/>
+        </w:rPr>
+        <w:t>:</w:t>
+      </w:r>
+      <w:r>
+        <w:rPr>
+          <w:rFonts w:cs="2  Nazanin"/>
+          <w:sz w:val="28"/>
+          <w:szCs w:val="28"/>
+          <w:lang w:bidi="fa-IR"/>
+        </w:rPr>
+        <w:t xml:space="preserve"> </w:t>
+      </w:r>
+      <w:r>
+        <w:rPr>
+          <w:rFonts w:cs="2  Nazanin"/>
+          <w:sz w:val="28"/>
+          <w:szCs w:val="28"/>
+          <w:rtl/>
+        </w:rPr>
+        <w:t>اسکن‌های پزشکی حاوی حساس‌ترین اطلاعات بیماران هستند. رعایت قوانینی مثل</w:t>
+      </w:r>
+      <w:r>
+        <w:rPr>
+          <w:rFonts w:cs="2  Nazanin"/>
+          <w:sz w:val="28"/>
+          <w:szCs w:val="28"/>
+          <w:lang w:bidi="fa-IR"/>
+        </w:rPr>
+        <w:t xml:space="preserve"> HIPAA </w:t>
+      </w:r>
+      <w:r>
+        <w:rPr>
+          <w:rFonts w:cs="2  Nazanin"/>
+          <w:sz w:val="28"/>
+          <w:szCs w:val="28"/>
+          <w:rtl/>
+        </w:rPr>
+        <w:t>(در آمریکا) یا</w:t>
+      </w:r>
+      <w:r>
+        <w:rPr>
+          <w:rFonts w:cs="2  Nazanin"/>
+          <w:sz w:val="28"/>
+          <w:szCs w:val="28"/>
+          <w:lang w:bidi="fa-IR"/>
+        </w:rPr>
+        <w:t xml:space="preserve"> GDPR </w:t>
+      </w:r>
+      <w:r>
+        <w:rPr>
+          <w:rFonts w:cs="2  Nazanin"/>
+          <w:sz w:val="28"/>
+          <w:szCs w:val="28"/>
+          <w:rtl/>
+        </w:rPr>
+        <w:t>(در اروپا) الزامی است. داده‌ها باید پیش از پردازش کاملاً بی‌نام</w:t>
+      </w:r>
+      <w:r>
+        <w:rPr>
+          <w:rFonts w:cs="2  Nazanin"/>
+          <w:sz w:val="28"/>
+          <w:szCs w:val="28"/>
+          <w:lang w:bidi="fa-IR"/>
+        </w:rPr>
+        <w:t xml:space="preserve"> (De-identified) </w:t>
+      </w:r>
+      <w:r>
+        <w:rPr>
+          <w:rFonts w:cs="2  Nazanin"/>
+          <w:sz w:val="28"/>
+          <w:szCs w:val="28"/>
+          <w:rtl/>
+        </w:rPr>
+        <w:t>شوند تا در صورت هک شدن سرور، هویت بیماران فاش نشود</w:t>
+      </w:r>
+      <w:r>
+        <w:rPr>
+          <w:rFonts w:cs="2  Nazanin"/>
+          <w:sz w:val="28"/>
+          <w:szCs w:val="28"/>
+          <w:lang w:bidi="fa-IR"/>
+        </w:rPr>
+        <w:t xml:space="preserve">. </w:t>
+      </w:r>
+    </w:p>
+    <w:p>
+      <w:pPr>
+        <w:bidi/>
+        <w:jc w:val="both"/>
+        <w:rPr>
+          <w:rFonts w:cs="2  Nazanin"/>
+          <w:sz w:val="28"/>
+          <w:szCs w:val="28"/>
+          <w:lang w:bidi="fa-IR"/>
+        </w:rPr>
+      </w:pPr>
+      <w:r>
+        <w:rPr>
+          <w:rFonts w:cs="2  Nazanin"/>
+          <w:b/>
+          <w:bCs/>
+          <w:sz w:val="28"/>
+          <w:szCs w:val="28"/>
+          <w:lang w:bidi="fa-IR"/>
+        </w:rPr>
+        <w:t xml:space="preserve"> </w:t>
+      </w:r>
+      <w:r>
+        <w:rPr>
+          <w:rFonts w:cs="2  Nazanin"/>
+          <w:b/>
+          <w:bCs/>
+          <w:sz w:val="28"/>
+          <w:szCs w:val="28"/>
+          <w:rtl/>
+        </w:rPr>
+        <w:t>شفافیت</w:t>
+      </w:r>
+      <w:r>
+        <w:rPr>
+          <w:rFonts w:cs="2  Nazanin"/>
+          <w:b/>
+          <w:bCs/>
+          <w:sz w:val="28"/>
+          <w:szCs w:val="28"/>
+          <w:lang w:bidi="fa-IR"/>
+        </w:rPr>
+        <w:t xml:space="preserve"> (Explainability) </w:t>
+      </w:r>
+      <w:r>
+        <w:rPr>
+          <w:rFonts w:cs="2  Nazanin"/>
+          <w:b/>
+          <w:bCs/>
+          <w:sz w:val="28"/>
+          <w:szCs w:val="28"/>
+          <w:rtl/>
+        </w:rPr>
+        <w:t>و کاهش سوگیری</w:t>
+      </w:r>
+      <w:r>
+        <w:rPr>
+          <w:rFonts w:cs="2  Nazanin"/>
+          <w:b/>
+          <w:bCs/>
+          <w:sz w:val="28"/>
+          <w:szCs w:val="28"/>
+          <w:lang w:bidi="fa-IR"/>
+        </w:rPr>
+        <w:t xml:space="preserve"> (Bias):</w:t>
+      </w:r>
+      <w:r>
+        <w:rPr>
+          <w:rFonts w:cs="2  Nazanin"/>
+          <w:sz w:val="28"/>
+          <w:szCs w:val="28"/>
+          <w:lang w:bidi="fa-IR"/>
+        </w:rPr>
+        <w:t xml:space="preserve"> </w:t>
+      </w:r>
+      <w:r>
+        <w:rPr>
+          <w:rFonts w:cs="2  Nazanin"/>
+          <w:sz w:val="28"/>
+          <w:szCs w:val="28"/>
+          <w:rtl/>
+        </w:rPr>
+        <w:t xml:space="preserve">پزشک باید بداند مدل </w:t>
+      </w:r>
+      <w:r>
+        <w:rPr>
+          <w:rFonts w:cs="2  Nazanin"/>
+          <w:i/>
+          <w:iCs/>
+          <w:sz w:val="28"/>
+          <w:szCs w:val="28"/>
+          <w:rtl/>
+        </w:rPr>
+        <w:t>چرا</w:t>
+      </w:r>
+      <w:r>
+        <w:rPr>
+          <w:rFonts w:cs="2  Nazanin"/>
+          <w:sz w:val="28"/>
+          <w:szCs w:val="28"/>
+          <w:rtl/>
+        </w:rPr>
+        <w:t xml:space="preserve"> یک ناحیه را تومور تشخیص داده است</w:t>
+      </w:r>
+      <w:r>
+        <w:rPr>
+          <w:rFonts w:cs="2  Nazanin"/>
+          <w:sz w:val="28"/>
+          <w:szCs w:val="28"/>
+          <w:lang w:bidi="fa-IR"/>
+        </w:rPr>
+        <w:t xml:space="preserve"> (</w:t>
+      </w:r>
+      <w:r>
+        <w:rPr>
+          <w:rFonts w:cs="2  Nazanin"/>
+          <w:sz w:val="28"/>
+          <w:szCs w:val="28"/>
+          <w:rtl/>
+        </w:rPr>
+        <w:t>جعبه سیاه بودن مدل‌های</w:t>
+      </w:r>
+      <w:r>
+        <w:rPr>
+          <w:rFonts w:cs="2  Nazanin"/>
+          <w:sz w:val="28"/>
+          <w:szCs w:val="28"/>
+          <w:lang w:bidi="fa-IR"/>
+        </w:rPr>
+        <w:t xml:space="preserve"> Deep Learning </w:t>
+      </w:r>
+      <w:r>
+        <w:rPr>
+          <w:rFonts w:cs="2  Nazanin"/>
+          <w:sz w:val="28"/>
+          <w:szCs w:val="28"/>
+          <w:rtl/>
+        </w:rPr>
+        <w:t>یک چالش است</w:t>
+      </w:r>
+      <w:r>
+        <w:rPr>
+          <w:rFonts w:cs="2  Nazanin"/>
+          <w:sz w:val="28"/>
+          <w:szCs w:val="28"/>
+          <w:lang w:bidi="fa-IR"/>
+        </w:rPr>
+        <w:t xml:space="preserve">). </w:t>
+      </w:r>
+      <w:r>
+        <w:rPr>
+          <w:rFonts w:cs="2  Nazanin"/>
+          <w:sz w:val="28"/>
+          <w:szCs w:val="28"/>
+          <w:rtl/>
+        </w:rPr>
+        <w:t>همچنین باید مطمئن شد مدل دچار سوگیری نشده و روی نژادها، سنین یا جنسیت‌های خاصی ضعیف‌تر عمل نمی‌کند (تعمیم‌پذیری عادلانه)</w:t>
+      </w:r>
+      <w:r>
+        <w:rPr>
+          <w:rFonts w:cs="2  Nazanin"/>
+          <w:sz w:val="28"/>
+          <w:szCs w:val="28"/>
+          <w:lang w:bidi="fa-IR"/>
+        </w:rPr>
+        <w:t xml:space="preserve">. </w:t>
+      </w:r>
+    </w:p>
+    <w:p>
+      <w:pPr>
+        <w:bidi/>
+        <w:jc w:val="both"/>
+        <w:rPr>
+          <w:rFonts w:cs="2  Nazanin" w:hint="cs"/>
+          <w:sz w:val="28"/>
+          <w:szCs w:val="28"/>
+          <w:rtl/>
+          <w:lang w:bidi="fa-IR"/>
+        </w:rPr>
+      </w:pPr>
+      <w:r>
+        <w:rPr>
+          <w:rFonts w:cs="2  Nazanin"/>
+          <w:b/>
+          <w:bCs/>
+          <w:sz w:val="28"/>
+          <w:szCs w:val="28"/>
+          <w:rtl/>
+        </w:rPr>
+        <w:t>مسئولیت‌پذیری در خطاها</w:t>
+      </w:r>
+      <w:r>
+        <w:rPr>
+          <w:rFonts w:cs="2  Nazanin"/>
+          <w:b/>
+          <w:bCs/>
+          <w:sz w:val="28"/>
+          <w:szCs w:val="28"/>
+          <w:lang w:bidi="fa-IR"/>
+        </w:rPr>
+        <w:t>:</w:t>
+      </w:r>
+      <w:r>
+        <w:rPr>
+          <w:rFonts w:cs="2  Nazanin"/>
+          <w:sz w:val="28"/>
+          <w:szCs w:val="28"/>
+          <w:lang w:bidi="fa-IR"/>
+        </w:rPr>
+        <w:t xml:space="preserve"> </w:t>
+      </w:r>
+      <w:r>
+        <w:rPr>
+          <w:rFonts w:cs="2  Nazanin"/>
+          <w:sz w:val="28"/>
+          <w:szCs w:val="28"/>
+          <w:rtl/>
+        </w:rPr>
+        <w:t>اگر مدل یک تومور بدخیم را تشخیص ندهد</w:t>
+      </w:r>
+      <w:r>
+        <w:rPr>
+          <w:rFonts w:cs="2  Nazanin"/>
+          <w:sz w:val="28"/>
+          <w:szCs w:val="28"/>
+          <w:lang w:bidi="fa-IR"/>
+        </w:rPr>
+        <w:t xml:space="preserve"> (False Negative) </w:t>
+      </w:r>
+      <w:r>
+        <w:rPr>
+          <w:rFonts w:cs="2  Nazanin"/>
+          <w:sz w:val="28"/>
+          <w:szCs w:val="28"/>
+          <w:rtl/>
+        </w:rPr>
+        <w:t>و بیمار آسیب ببیند، مقصر کیست؟ طراح مدل، بیمارستان یا رادیولوژیست؟ از نظر قانونی، هوش مصنوعی در پزشکی فعلاً نقش «دستیار تصمیم‌گیری</w:t>
+      </w:r>
+      <w:r>
+        <w:rPr>
+          <w:rFonts w:cs="2  Nazanin"/>
+          <w:sz w:val="28"/>
+          <w:szCs w:val="28"/>
+          <w:lang w:bidi="fa-IR"/>
+        </w:rPr>
+        <w:t xml:space="preserve">» (Decision Support System) </w:t>
+      </w:r>
+      <w:r>
+        <w:rPr>
+          <w:rFonts w:cs="2  Nazanin"/>
+          <w:sz w:val="28"/>
+          <w:szCs w:val="28"/>
+          <w:rtl/>
+        </w:rPr>
+        <w:t>را دارد و مسئولیت نهایی همیشه با پزشک متخصص است</w:t>
+      </w:r>
+      <w:r>
+        <w:rPr>
+          <w:rFonts w:cs="2  Nazanin"/>
+          <w:sz w:val="28"/>
+          <w:szCs w:val="28"/>
+          <w:lang w:bidi="fa-IR"/>
+        </w:rPr>
+        <w:t>.</w:t>
+      </w:r>
     </w:p>
     <w:sectPr>
       <w:pgSz w:w="12240" w:h="15840"/>
@@ -14153,6 +15038,119 @@
     </w:lvl>
   </w:abstractNum>
   <w:abstractNum w:abstractNumId="31" w15:restartNumberingAfterBreak="0">
+    <w:nsid w:val="7E76514E"/>
+    <w:multiLevelType w:val="hybridMultilevel"/>
+    <w:tmpl w:val="B9E0388C"/>
+    <w:lvl w:ilvl="0" w:tplc="04090003">
+      <w:start w:val="1"/>
+      <w:numFmt w:val="bullet"/>
+      <w:lvlText w:val="o"/>
+      <w:lvlJc w:val="left"/>
+      <w:pPr>
+        <w:ind w:left="720" w:hanging="360"/>
+      </w:pPr>
+      <w:rPr>
+        <w:rFonts w:ascii="Courier New" w:hAnsi="Courier New" w:cs="Courier New" w:hint="default"/>
+      </w:rPr>
+    </w:lvl>
+    <w:lvl w:ilvl="1" w:tplc="04090003" w:tentative="1">
+      <w:start w:val="1"/>
+      <w:numFmt w:val="bullet"/>
+      <w:lvlText w:val="o"/>
+      <w:lvlJc w:val="left"/>
+      <w:pPr>
+        <w:ind w:left="1440" w:hanging="360"/>
+      </w:pPr>
+      <w:rPr>
+        <w:rFonts w:ascii="Courier New" w:hAnsi="Courier New" w:cs="Courier New" w:hint="default"/>
+      </w:rPr>
+    </w:lvl>
+    <w:lvl w:ilvl="2" w:tplc="04090005" w:tentative="1">
+      <w:start w:val="1"/>
+      <w:numFmt w:val="bullet"/>
+      <w:lvlText w:val=""/>
+      <w:lvlJc w:val="left"/>
+      <w:pPr>
+        <w:ind w:left="2160" w:hanging="360"/>
+      </w:pPr>
+      <w:rPr>
+        <w:rFonts w:ascii="Wingdings" w:hAnsi="Wingdings" w:hint="default"/>
+      </w:rPr>
+    </w:lvl>
+    <w:lvl w:ilvl="3" w:tplc="04090001" w:tentative="1">
+      <w:start w:val="1"/>
+      <w:numFmt w:val="bullet"/>
+      <w:lvlText w:val=""/>
+      <w:lvlJc w:val="left"/>
+      <w:pPr>
+        <w:ind w:left="2880" w:hanging="360"/>
+      </w:pPr>
+      <w:rPr>
+        <w:rFonts w:ascii="Symbol" w:hAnsi="Symbol" w:hint="default"/>
+      </w:rPr>
+    </w:lvl>
+    <w:lvl w:ilvl="4" w:tplc="04090003" w:tentative="1">
+      <w:start w:val="1"/>
+      <w:numFmt w:val="bullet"/>
+      <w:lvlText w:val="o"/>
+      <w:lvlJc w:val="left"/>
+      <w:pPr>
+        <w:ind w:left="3600" w:hanging="360"/>
+      </w:pPr>
+      <w:rPr>
+        <w:rFonts w:ascii="Courier New" w:hAnsi="Courier New" w:cs="Courier New" w:hint="default"/>
+      </w:rPr>
+    </w:lvl>
+    <w:lvl w:ilvl="5" w:tplc="04090005" w:tentative="1">
+      <w:start w:val="1"/>
+      <w:numFmt w:val="bullet"/>
+      <w:lvlText w:val=""/>
+      <w:lvlJc w:val="left"/>
+      <w:pPr>
+        <w:ind w:left="4320" w:hanging="360"/>
+      </w:pPr>
+      <w:rPr>
+        <w:rFonts w:ascii="Wingdings" w:hAnsi="Wingdings" w:hint="default"/>
+      </w:rPr>
+    </w:lvl>
+    <w:lvl w:ilvl="6" w:tplc="04090001" w:tentative="1">
+      <w:start w:val="1"/>
+      <w:numFmt w:val="bullet"/>
+      <w:lvlText w:val=""/>
+      <w:lvlJc w:val="left"/>
+      <w:pPr>
+        <w:ind w:left="5040" w:hanging="360"/>
+      </w:pPr>
+      <w:rPr>
+        <w:rFonts w:ascii="Symbol" w:hAnsi="Symbol" w:hint="default"/>
+      </w:rPr>
+    </w:lvl>
+    <w:lvl w:ilvl="7" w:tplc="04090003" w:tentative="1">
+      <w:start w:val="1"/>
+      <w:numFmt w:val="bullet"/>
+      <w:lvlText w:val="o"/>
+      <w:lvlJc w:val="left"/>
+      <w:pPr>
+        <w:ind w:left="5760" w:hanging="360"/>
+      </w:pPr>
+      <w:rPr>
+        <w:rFonts w:ascii="Courier New" w:hAnsi="Courier New" w:cs="Courier New" w:hint="default"/>
+      </w:rPr>
+    </w:lvl>
+    <w:lvl w:ilvl="8" w:tplc="04090005" w:tentative="1">
+      <w:start w:val="1"/>
+      <w:numFmt w:val="bullet"/>
+      <w:lvlText w:val=""/>
+      <w:lvlJc w:val="left"/>
+      <w:pPr>
+        <w:ind w:left="6480" w:hanging="360"/>
+      </w:pPr>
+      <w:rPr>
+        <w:rFonts w:ascii="Wingdings" w:hAnsi="Wingdings" w:hint="default"/>
+      </w:rPr>
+    </w:lvl>
+  </w:abstractNum>
+  <w:abstractNum w:abstractNumId="32" w15:restartNumberingAfterBreak="0">
     <w:nsid w:val="7EC94175"/>
     <w:multiLevelType w:val="hybridMultilevel"/>
     <w:tmpl w:val="ECA87FA6"/>
@@ -14265,7 +15263,7 @@
       </w:rPr>
     </w:lvl>
   </w:abstractNum>
-  <w:abstractNum w:abstractNumId="32" w15:restartNumberingAfterBreak="0">
+  <w:abstractNum w:abstractNumId="33" w15:restartNumberingAfterBreak="0">
     <w:nsid w:val="7F3C046E"/>
     <w:multiLevelType w:val="multilevel"/>
     <w:tmpl w:val="2EB67290"/>
@@ -14436,7 +15434,7 @@
     <w:abstractNumId w:val="7"/>
   </w:num>
   <w:num w:numId="8" w16cid:durableId="1096173709">
-    <w:abstractNumId w:val="32"/>
+    <w:abstractNumId w:val="33"/>
   </w:num>
   <w:num w:numId="9" w16cid:durableId="435255649">
     <w:abstractNumId w:val="5"/>
@@ -14499,7 +15497,7 @@
     <w:abstractNumId w:val="29"/>
   </w:num>
   <w:num w:numId="28" w16cid:durableId="64112163">
-    <w:abstractNumId w:val="31"/>
+    <w:abstractNumId w:val="32"/>
   </w:num>
   <w:num w:numId="29" w16cid:durableId="2091272254">
     <w:abstractNumId w:val="13"/>
@@ -14515,6 +15513,9 @@
   </w:num>
   <w:num w:numId="33" w16cid:durableId="537816476">
     <w:abstractNumId w:val="18"/>
+  </w:num>
+  <w:num w:numId="34" w16cid:durableId="873273955">
+    <w:abstractNumId w:val="31"/>
   </w:num>
 </w:numbering>
 </file>

</xml_diff>